<commit_message>
feat: splash screens, favicon, logout e máscara de telefone
</commit_message>
<xml_diff>
--- a/docs/resumos_do_projeto/resumo-01-08-2026-14h.docx
+++ b/docs/resumos_do_projeto/resumo-01-08-2026-14h.docx
@@ -9,47 +9,7 @@
     </w:p>
     <w:p>
       <w:r>
-        <w:t xml:space="preserve">STACK: Next.js 15 (App </w:t>
-      </w:r>
-      <w:proofErr w:type="spellStart"/>
-      <w:r>
-        <w:t>Router</w:t>
-      </w:r>
-      <w:proofErr w:type="spellEnd"/>
-      <w:r>
-        <w:t xml:space="preserve">, </w:t>
-      </w:r>
-      <w:proofErr w:type="spellStart"/>
-      <w:r>
-        <w:t>Turbopack</w:t>
-      </w:r>
-      <w:proofErr w:type="spellEnd"/>
-      <w:r>
-        <w:t xml:space="preserve">), </w:t>
-      </w:r>
-      <w:proofErr w:type="spellStart"/>
-      <w:r>
-        <w:t>Supabase</w:t>
-      </w:r>
-      <w:proofErr w:type="spellEnd"/>
-      <w:r>
-        <w:t xml:space="preserve">, </w:t>
-      </w:r>
-      <w:proofErr w:type="spellStart"/>
-      <w:r>
-        <w:t>Tailwind</w:t>
-      </w:r>
-      <w:proofErr w:type="spellEnd"/>
-      <w:r>
-        <w:t xml:space="preserve"> CSS, </w:t>
-      </w:r>
-      <w:proofErr w:type="spellStart"/>
-      <w:r>
-        <w:t>TypeScript</w:t>
-      </w:r>
-      <w:proofErr w:type="spellEnd"/>
-      <w:r>
-        <w:t>.</w:t>
+        <w:t>STACK: Next.js 15 (App Router, Turbopack), Supabase, Tailwind CSS, TypeScript.</w:t>
       </w:r>
     </w:p>
     <w:p/>
@@ -70,36 +30,12 @@
     </w:p>
     <w:p>
       <w:r>
-        <w:t xml:space="preserve">3. Criação de Vistoria: Formulário em '/vistoria/nova' com autocomplete de CEP via API </w:t>
-      </w:r>
-      <w:proofErr w:type="spellStart"/>
-      <w:r>
-        <w:t>ViaCEP</w:t>
-      </w:r>
-      <w:proofErr w:type="spellEnd"/>
-      <w:r>
-        <w:t xml:space="preserve"> (preenche rua, bairro, cidade). Salva no banco e redireciona.</w:t>
-      </w:r>
-    </w:p>
-    <w:p>
-      <w:r>
-        <w:t>4. Detalhes da Vistoria: Rota dinâmica '/vistoria/[id]' funcionando (com correção do '</w:t>
-      </w:r>
-      <w:proofErr w:type="spellStart"/>
-      <w:r>
-        <w:t>await</w:t>
-      </w:r>
-      <w:proofErr w:type="spellEnd"/>
-      <w:r>
-        <w:t xml:space="preserve"> </w:t>
-      </w:r>
-      <w:proofErr w:type="spellStart"/>
-      <w:r>
-        <w:t>params</w:t>
-      </w:r>
-      <w:proofErr w:type="spellEnd"/>
-      <w:r>
-        <w:t>' do Next.js 15). Exibe dados do cliente e endereço formatado.</w:t>
+        <w:t>3. Criação de Vistoria: Formulário em '/vistoria/nova' com autocomplete de CEP via API ViaCEP (preenche rua, bairro, cidade). Salva no banco e redireciona.</w:t>
+      </w:r>
+    </w:p>
+    <w:p>
+      <w:r>
+        <w:t>4. Detalhes da Vistoria: Rota dinâmica '/vistoria/[id]' funcionando (com correção do 'await params' do Next.js 15). Exibe dados do cliente e endereço formatado.</w:t>
       </w:r>
     </w:p>
     <w:p/>
@@ -110,214 +46,20 @@
     </w:p>
     <w:p>
       <w:r>
-        <w:t xml:space="preserve">- Tabela 'profiles': id (UUID, </w:t>
-      </w:r>
-      <w:proofErr w:type="spellStart"/>
-      <w:r>
-        <w:t>ref</w:t>
-      </w:r>
-      <w:proofErr w:type="spellEnd"/>
-      <w:r>
-        <w:t xml:space="preserve"> </w:t>
-      </w:r>
-      <w:proofErr w:type="spellStart"/>
-      <w:proofErr w:type="gramStart"/>
-      <w:r>
-        <w:t>auth.users</w:t>
-      </w:r>
-      <w:proofErr w:type="spellEnd"/>
-      <w:proofErr w:type="gramEnd"/>
-      <w:r>
-        <w:t xml:space="preserve">), nome, </w:t>
-      </w:r>
-      <w:proofErr w:type="spellStart"/>
-      <w:r>
-        <w:t>email</w:t>
-      </w:r>
-      <w:proofErr w:type="spellEnd"/>
-      <w:r>
-        <w:t xml:space="preserve">, </w:t>
-      </w:r>
-      <w:proofErr w:type="spellStart"/>
-      <w:r>
-        <w:t>criado_em</w:t>
-      </w:r>
-      <w:proofErr w:type="spellEnd"/>
-      <w:r>
-        <w:t>.</w:t>
-      </w:r>
-    </w:p>
-    <w:p>
-      <w:r>
-        <w:t xml:space="preserve">- Tabela 'vistorias': id (UUID), </w:t>
-      </w:r>
-      <w:proofErr w:type="spellStart"/>
-      <w:r>
-        <w:t>user_id</w:t>
-      </w:r>
-      <w:proofErr w:type="spellEnd"/>
-      <w:r>
-        <w:t xml:space="preserve"> (UUID), tipo (TEXT), </w:t>
-      </w:r>
-      <w:proofErr w:type="spellStart"/>
-      <w:r>
-        <w:t>nome_cliente</w:t>
-      </w:r>
-      <w:proofErr w:type="spellEnd"/>
-      <w:r>
-        <w:t xml:space="preserve"> (TEXT), </w:t>
-      </w:r>
-      <w:proofErr w:type="spellStart"/>
-      <w:r>
-        <w:t>endereco_cep</w:t>
-      </w:r>
-      <w:proofErr w:type="spellEnd"/>
-      <w:r>
-        <w:t xml:space="preserve"> (TEXT), </w:t>
-      </w:r>
-      <w:proofErr w:type="spellStart"/>
-      <w:r>
-        <w:t>endereco_rua</w:t>
-      </w:r>
-      <w:proofErr w:type="spellEnd"/>
-      <w:r>
-        <w:t xml:space="preserve"> (TEXT), </w:t>
-      </w:r>
-      <w:proofErr w:type="spellStart"/>
-      <w:r>
-        <w:t>endereco_bairro</w:t>
-      </w:r>
-      <w:proofErr w:type="spellEnd"/>
-      <w:r>
-        <w:t xml:space="preserve"> (TEXT), </w:t>
-      </w:r>
-      <w:proofErr w:type="spellStart"/>
-      <w:r>
-        <w:t>endereco_cidade</w:t>
-      </w:r>
-      <w:proofErr w:type="spellEnd"/>
-      <w:r>
-        <w:t xml:space="preserve"> (TEXT), </w:t>
-      </w:r>
-      <w:proofErr w:type="spellStart"/>
-      <w:r>
-        <w:t>endereco_numero</w:t>
-      </w:r>
-      <w:proofErr w:type="spellEnd"/>
-      <w:r>
-        <w:t xml:space="preserve"> (TEXT), </w:t>
-      </w:r>
-      <w:proofErr w:type="spellStart"/>
-      <w:r>
-        <w:t>endereco_complemento</w:t>
-      </w:r>
-      <w:proofErr w:type="spellEnd"/>
-      <w:r>
-        <w:t xml:space="preserve"> (TEXT), </w:t>
-      </w:r>
-      <w:proofErr w:type="spellStart"/>
-      <w:r>
-        <w:t>data_vistoria</w:t>
-      </w:r>
-      <w:proofErr w:type="spellEnd"/>
-      <w:r>
-        <w:t xml:space="preserve"> (DATE), status (TEXT, default 'RASCUNHO'), </w:t>
-      </w:r>
-      <w:proofErr w:type="spellStart"/>
-      <w:r>
-        <w:t>criado_em</w:t>
-      </w:r>
-      <w:proofErr w:type="spellEnd"/>
-      <w:r>
-        <w:t>.</w:t>
-      </w:r>
-    </w:p>
-    <w:p>
-      <w:r>
-        <w:t>- Tabela '</w:t>
-      </w:r>
-      <w:proofErr w:type="spellStart"/>
-      <w:r>
-        <w:t>comodos</w:t>
-      </w:r>
-      <w:proofErr w:type="spellEnd"/>
-      <w:r>
-        <w:t xml:space="preserve">': id (UUID), </w:t>
-      </w:r>
-      <w:proofErr w:type="spellStart"/>
-      <w:r>
-        <w:t>vistoria_id</w:t>
-      </w:r>
-      <w:proofErr w:type="spellEnd"/>
-      <w:r>
-        <w:t xml:space="preserve"> (UUID, </w:t>
-      </w:r>
-      <w:proofErr w:type="spellStart"/>
-      <w:r>
-        <w:t>ref</w:t>
-      </w:r>
-      <w:proofErr w:type="spellEnd"/>
-      <w:r>
-        <w:t xml:space="preserve"> vistorias), </w:t>
-      </w:r>
-      <w:proofErr w:type="spellStart"/>
-      <w:r>
-        <w:t>nome_comodo</w:t>
-      </w:r>
-      <w:proofErr w:type="spellEnd"/>
-      <w:r>
-        <w:t xml:space="preserve"> (TEXT), </w:t>
-      </w:r>
-      <w:proofErr w:type="spellStart"/>
-      <w:r>
-        <w:t>descricao_bruta</w:t>
-      </w:r>
-      <w:proofErr w:type="spellEnd"/>
-      <w:r>
-        <w:t xml:space="preserve"> (TEXT), </w:t>
-      </w:r>
-      <w:proofErr w:type="spellStart"/>
-      <w:r>
-        <w:t>descricao_processada_ia</w:t>
-      </w:r>
-      <w:proofErr w:type="spellEnd"/>
-      <w:r>
-        <w:t xml:space="preserve"> (TEXT), ordem (INTEGER), </w:t>
-      </w:r>
-      <w:proofErr w:type="spellStart"/>
-      <w:r>
-        <w:t>criado_em</w:t>
-      </w:r>
-      <w:proofErr w:type="spellEnd"/>
-      <w:r>
-        <w:t>. (RLS desativada).</w:t>
-      </w:r>
-    </w:p>
-    <w:p/>
-    <w:p>
-      <w:r>
-        <w:t>PRÓXIMO PASSO PENDENTE:</w:t>
-      </w:r>
-    </w:p>
-    <w:p>
-      <w:r>
-        <w:t>Implementar a funcionalidade de "Adicionar Cômodo" na tela de detalhes da vistoria ([id]/</w:t>
-      </w:r>
-      <w:proofErr w:type="spellStart"/>
-      <w:r>
-        <w:t>page.tsx</w:t>
-      </w:r>
-      <w:proofErr w:type="spellEnd"/>
-      <w:r>
-        <w:t>), permitindo salvar dados na tabela '</w:t>
-      </w:r>
-      <w:proofErr w:type="spellStart"/>
-      <w:r>
-        <w:t>comodos</w:t>
-      </w:r>
-      <w:proofErr w:type="spellEnd"/>
-      <w:r>
-        <w:t>' e listá-los na tela.</w:t>
+        <w:t>- Tabela 'profiles': id (UUID, ref auth.users), nome, email, criado_em.</w:t>
+      </w:r>
+    </w:p>
+    <w:p>
+      <w:r>
+        <w:t>- Tabela 'vistorias': id (UUID), user_id (UUID), tipo (TEXT), nome_cliente (TEXT), endereco_cep (TEXT), endereco_rua (TEXT), endereco_bairro (TEXT), endereco_cidade (TEXT), endereco_numero (TEXT), endereco_complemento (TEXT), data_vistoria (DATE), status (TEXT, default 'RASCUNHO'), criado_em.</w:t>
+      </w:r>
+    </w:p>
+    <w:p>
+      <w:r>
+        <w:t>- Tabela 'comodos': id (UUID), vistoria_id (UUID, ref vistorias), nome_comodo (TEXT), descricao_bruta (TEXT), descricao_processada_ia (TEXT), ordem (INTEGER), criado_em. (RLS desativada).</w:t>
+      </w:r>
+      <w:r>
+        <w:t xml:space="preserve"> Documento em</w:t>
       </w:r>
     </w:p>
     <w:sectPr>

</xml_diff>